<commit_message>
Dodaj endpoint zaliczenia-zip i aktualizacja szablonów dokumentów
- Zarejestruj endpoint zaliczenia-zip w documents/urls.py
- Zaktualizuj szablony certyfikat.docx, certyfikat.r.docx, sprawozdanie-egzamin-rec.docx
- Dodaj nowy szablon zaliczenia_tematow_KPP.docx

Co-Authored-By: Claude Sonnet 4.6 <noreply@anthropic.com>
</commit_message>
<xml_diff>
--- a/backend/documents/templates/certyfikat.docx
+++ b/backend/documents/templates/certyfikat.docx
@@ -536,10 +536,145 @@
       <w:r>
         <w:rPr>
           <w:rFonts w:ascii="Times New Roman" w:hAnsi="Times New Roman" w:cs="Times New Roman"/>
+          <w:sz w:val="26"/>
+          <w:szCs w:val="26"/>
+        </w:rPr>
+        <w:t xml:space="preserve">Nr </w:t>
+      </w:r>
+      <w:r>
+        <w:rPr>
+          <w:rFonts w:ascii="Times New Roman" w:hAnsi="Times New Roman" w:cs="Times New Roman"/>
+          <w:b/>
+          <w:bCs/>
+          <w:sz w:val="26"/>
+          <w:szCs w:val="26"/>
+        </w:rPr>
+        <w:t>KPP/</w:t>
+      </w:r>
+      <w:r>
+        <w:rPr>
+          <w:rFonts w:ascii="Times New Roman" w:hAnsi="Times New Roman" w:cs="Times New Roman"/>
+          <w:b/>
+          <w:bCs/>
+          <w:color w:val="EE0000"/>
+          <w:sz w:val="26"/>
+          <w:szCs w:val="26"/>
+        </w:rPr>
+        <w:t>E</w:t>
+      </w:r>
+      <w:r>
+        <w:rPr>
+          <w:rFonts w:ascii="Times New Roman" w:hAnsi="Times New Roman" w:cs="Times New Roman"/>
+          <w:b/>
+          <w:bCs/>
+          <w:sz w:val="26"/>
+          <w:szCs w:val="26"/>
+        </w:rPr>
+        <w:t>K/</w:t>
+      </w:r>
+      <w:r>
+        <w:rPr>
+          <w:rFonts w:ascii="Times New Roman" w:hAnsi="Times New Roman" w:cs="Times New Roman"/>
+          <w:b/>
+          <w:bCs/>
+          <w:sz w:val="26"/>
+          <w:szCs w:val="26"/>
+        </w:rPr>
+        <w:t>{{</w:t>
+      </w:r>
+      <w:proofErr w:type="spellStart"/>
+      <w:r>
+        <w:rPr>
+          <w:rFonts w:ascii="Times New Roman" w:hAnsi="Times New Roman" w:cs="Times New Roman"/>
+          <w:b/>
+          <w:bCs/>
+          <w:sz w:val="26"/>
+          <w:szCs w:val="26"/>
+        </w:rPr>
+        <w:t>c_n</w:t>
+      </w:r>
+      <w:proofErr w:type="spellEnd"/>
+      <w:r>
+        <w:rPr>
+          <w:rFonts w:ascii="Times New Roman" w:hAnsi="Times New Roman" w:cs="Times New Roman"/>
+          <w:b/>
+          <w:bCs/>
+          <w:sz w:val="26"/>
+          <w:szCs w:val="26"/>
+        </w:rPr>
+        <w:t>}}</w:t>
+      </w:r>
+      <w:r>
+        <w:rPr>
+          <w:rFonts w:ascii="Times New Roman" w:hAnsi="Times New Roman" w:cs="Times New Roman"/>
+          <w:b/>
+          <w:bCs/>
+          <w:sz w:val="26"/>
+          <w:szCs w:val="26"/>
+        </w:rPr>
+        <w:t>/</w:t>
+      </w:r>
+      <w:r>
+        <w:rPr>
+          <w:rFonts w:ascii="Times New Roman" w:hAnsi="Times New Roman" w:cs="Times New Roman"/>
+          <w:b/>
+          <w:bCs/>
+          <w:sz w:val="26"/>
+          <w:szCs w:val="26"/>
+        </w:rPr>
+        <w:t>{{y}}</w:t>
+      </w:r>
+      <w:r>
+        <w:rPr>
+          <w:rFonts w:ascii="Times New Roman" w:hAnsi="Times New Roman" w:cs="Times New Roman"/>
+          <w:b/>
+          <w:bCs/>
+          <w:sz w:val="26"/>
+          <w:szCs w:val="26"/>
+        </w:rPr>
+        <w:t>/</w:t>
+      </w:r>
+      <w:r>
+        <w:rPr>
+          <w:rFonts w:ascii="Times New Roman" w:hAnsi="Times New Roman" w:cs="Times New Roman"/>
+          <w:b/>
+          <w:bCs/>
+          <w:sz w:val="26"/>
+          <w:szCs w:val="26"/>
+        </w:rPr>
+        <w:t>{{</w:t>
+      </w:r>
+      <w:proofErr w:type="spellStart"/>
+      <w:r>
+        <w:rPr>
+          <w:rFonts w:ascii="Times New Roman" w:hAnsi="Times New Roman" w:cs="Times New Roman"/>
+          <w:b/>
+          <w:bCs/>
+          <w:sz w:val="26"/>
+          <w:szCs w:val="26"/>
+        </w:rPr>
+        <w:t>lp</w:t>
+      </w:r>
+      <w:proofErr w:type="spellEnd"/>
+      <w:r>
+        <w:rPr>
+          <w:rFonts w:ascii="Times New Roman" w:hAnsi="Times New Roman" w:cs="Times New Roman"/>
+          <w:b/>
+          <w:bCs/>
+          <w:sz w:val="26"/>
+          <w:szCs w:val="26"/>
+        </w:rPr>
+        <w:t>}}</w:t>
+      </w:r>
+      <w:r>
+        <w:rPr>
+          <w:rFonts w:ascii="Times New Roman" w:hAnsi="Times New Roman" w:cs="Times New Roman"/>
+          <w:b/>
+          <w:bCs/>
           <w:sz w:val="28"/>
           <w:szCs w:val="28"/>
         </w:rPr>
-        <w:t xml:space="preserve">Nr </w:t>
+        <w:fldChar w:fldCharType="begin"/>
       </w:r>
       <w:r>
         <w:rPr>
@@ -549,28 +684,7 @@
           <w:sz w:val="28"/>
           <w:szCs w:val="28"/>
         </w:rPr>
-        <w:t>KPP/</w:t>
-      </w:r>
-      <w:r>
-        <w:rPr>
-          <w:rFonts w:ascii="Times New Roman" w:hAnsi="Times New Roman" w:cs="Times New Roman"/>
-          <w:b/>
-          <w:bCs/>
-          <w:color w:val="EE0000"/>
-          <w:sz w:val="36"/>
-          <w:szCs w:val="36"/>
-        </w:rPr>
-        <w:t>E</w:t>
-      </w:r>
-      <w:r>
-        <w:rPr>
-          <w:rFonts w:ascii="Times New Roman" w:hAnsi="Times New Roman" w:cs="Times New Roman"/>
-          <w:b/>
-          <w:bCs/>
-          <w:sz w:val="36"/>
-          <w:szCs w:val="36"/>
-        </w:rPr>
-        <w:t>K</w:t>
+        <w:instrText xml:space="preserve"> MERGEFIELD "LP" </w:instrText>
       </w:r>
       <w:r>
         <w:rPr>
@@ -580,7 +694,7 @@
           <w:sz w:val="28"/>
           <w:szCs w:val="28"/>
         </w:rPr>
-        <w:t>/</w:t>
+        <w:fldChar w:fldCharType="separate"/>
       </w:r>
       <w:r>
         <w:rPr>
@@ -590,77 +704,7 @@
           <w:sz w:val="28"/>
           <w:szCs w:val="28"/>
         </w:rPr>
-        <w:t>0</w:t>
-      </w:r>
-      <w:r>
-        <w:rPr>
-          <w:rFonts w:ascii="Times New Roman" w:hAnsi="Times New Roman" w:cs="Times New Roman"/>
-          <w:b/>
-          <w:bCs/>
-          <w:sz w:val="28"/>
-          <w:szCs w:val="28"/>
-        </w:rPr>
-        <w:t>4</w:t>
-      </w:r>
-      <w:r>
-        <w:rPr>
-          <w:rFonts w:ascii="Times New Roman" w:hAnsi="Times New Roman" w:cs="Times New Roman"/>
-          <w:b/>
-          <w:bCs/>
-          <w:sz w:val="28"/>
-          <w:szCs w:val="28"/>
-        </w:rPr>
-        <w:t>/</w:t>
-      </w:r>
-      <w:r>
-        <w:rPr>
-          <w:rFonts w:ascii="Times New Roman" w:hAnsi="Times New Roman" w:cs="Times New Roman"/>
-          <w:b/>
-          <w:bCs/>
-          <w:sz w:val="28"/>
-          <w:szCs w:val="28"/>
-        </w:rPr>
-        <w:t>{{y}}</w:t>
-      </w:r>
-      <w:r>
-        <w:rPr>
-          <w:rFonts w:ascii="Times New Roman" w:hAnsi="Times New Roman" w:cs="Times New Roman"/>
-          <w:b/>
-          <w:bCs/>
-          <w:sz w:val="28"/>
-          <w:szCs w:val="28"/>
-        </w:rPr>
-        <w:t>/</w:t>
-      </w:r>
-      <w:r>
-        <w:rPr>
-          <w:rFonts w:ascii="Times New Roman" w:hAnsi="Times New Roman" w:cs="Times New Roman"/>
-          <w:b/>
-          <w:bCs/>
-          <w:sz w:val="28"/>
-          <w:szCs w:val="28"/>
-        </w:rPr>
-        <w:fldChar w:fldCharType="begin"/>
-      </w:r>
-      <w:r>
-        <w:rPr>
-          <w:rFonts w:ascii="Times New Roman" w:hAnsi="Times New Roman" w:cs="Times New Roman"/>
-          <w:b/>
-          <w:bCs/>
-          <w:sz w:val="28"/>
-          <w:szCs w:val="28"/>
-        </w:rPr>
-        <w:instrText xml:space="preserve"> MERGEFIELD "LP" </w:instrText>
-      </w:r>
-      <w:r>
-        <w:rPr>
-          <w:rFonts w:ascii="Times New Roman" w:hAnsi="Times New Roman" w:cs="Times New Roman"/>
-          <w:b/>
-          <w:bCs/>
-          <w:sz w:val="28"/>
-          <w:szCs w:val="28"/>
-        </w:rPr>
-        <w:fldChar w:fldCharType="separate"/>
+        <w:fldChar w:fldCharType="end"/>
       </w:r>
       <w:r>
         <w:rPr>
@@ -671,24 +715,19 @@
           <w:sz w:val="28"/>
           <w:szCs w:val="28"/>
         </w:rPr>
-        <w:t>«LP»</w:t>
-      </w:r>
-      <w:r>
-        <w:rPr>
-          <w:rFonts w:ascii="Times New Roman" w:hAnsi="Times New Roman" w:cs="Times New Roman"/>
-          <w:b/>
-          <w:bCs/>
+        <w:tab/>
+      </w:r>
+      <w:r>
+        <w:rPr>
+          <w:rFonts w:ascii="Times New Roman" w:hAnsi="Times New Roman" w:cs="Times New Roman"/>
           <w:sz w:val="28"/>
           <w:szCs w:val="28"/>
         </w:rPr>
-        <w:fldChar w:fldCharType="end"/>
-      </w:r>
-      <w:r>
-        <w:rPr>
-          <w:rFonts w:ascii="Times New Roman" w:hAnsi="Times New Roman" w:cs="Times New Roman"/>
-          <w:b/>
-          <w:bCs/>
-          <w:noProof/>
+        <w:tab/>
+      </w:r>
+      <w:r>
+        <w:rPr>
+          <w:rFonts w:ascii="Times New Roman" w:hAnsi="Times New Roman" w:cs="Times New Roman"/>
           <w:sz w:val="28"/>
           <w:szCs w:val="28"/>
         </w:rPr>
@@ -701,78 +740,59 @@
           <w:szCs w:val="28"/>
         </w:rPr>
         <w:tab/>
-      </w:r>
-      <w:r>
-        <w:rPr>
-          <w:rFonts w:ascii="Times New Roman" w:hAnsi="Times New Roman" w:cs="Times New Roman"/>
-          <w:sz w:val="28"/>
-          <w:szCs w:val="28"/>
-        </w:rPr>
-        <w:tab/>
-      </w:r>
-      <w:r>
-        <w:rPr>
-          <w:rFonts w:ascii="Times New Roman" w:hAnsi="Times New Roman" w:cs="Times New Roman"/>
-          <w:sz w:val="28"/>
-          <w:szCs w:val="28"/>
-        </w:rPr>
-        <w:tab/>
-      </w:r>
-      <w:r>
-        <w:rPr>
-          <w:rFonts w:ascii="Times New Roman" w:hAnsi="Times New Roman" w:cs="Times New Roman"/>
-          <w:sz w:val="28"/>
-          <w:szCs w:val="28"/>
+        <w:t xml:space="preserve">          </w:t>
+      </w:r>
+      <w:r>
+        <w:rPr>
+          <w:sz w:val="26"/>
+          <w:szCs w:val="26"/>
         </w:rPr>
         <w:t>{{</w:t>
       </w:r>
       <w:proofErr w:type="spellStart"/>
       <w:r>
         <w:rPr>
-          <w:rFonts w:ascii="Times New Roman" w:hAnsi="Times New Roman" w:cs="Times New Roman"/>
-          <w:sz w:val="28"/>
-          <w:szCs w:val="28"/>
+          <w:sz w:val="26"/>
+          <w:szCs w:val="26"/>
         </w:rPr>
         <w:t>exam_c</w:t>
       </w:r>
       <w:proofErr w:type="spellEnd"/>
       <w:r>
         <w:rPr>
-          <w:rFonts w:ascii="Times New Roman" w:hAnsi="Times New Roman" w:cs="Times New Roman"/>
-          <w:sz w:val="28"/>
-          <w:szCs w:val="28"/>
+          <w:sz w:val="26"/>
+          <w:szCs w:val="26"/>
         </w:rPr>
         <w:t>}}</w:t>
       </w:r>
       <w:r>
         <w:rPr>
-          <w:rFonts w:ascii="Times New Roman" w:hAnsi="Times New Roman" w:cs="Times New Roman"/>
-          <w:sz w:val="28"/>
-          <w:szCs w:val="28"/>
+          <w:sz w:val="26"/>
+          <w:szCs w:val="26"/>
         </w:rPr>
         <w:t>,</w:t>
       </w:r>
       <w:r>
         <w:rPr>
           <w:rFonts w:ascii="Times New Roman" w:hAnsi="Times New Roman" w:cs="Times New Roman"/>
-          <w:sz w:val="28"/>
-          <w:szCs w:val="28"/>
+          <w:sz w:val="26"/>
+          <w:szCs w:val="26"/>
         </w:rPr>
         <w:t xml:space="preserve"> </w:t>
       </w:r>
       <w:r>
         <w:rPr>
           <w:rFonts w:ascii="Times New Roman" w:hAnsi="Times New Roman" w:cs="Times New Roman"/>
-          <w:sz w:val="28"/>
-          <w:szCs w:val="28"/>
+          <w:sz w:val="26"/>
+          <w:szCs w:val="26"/>
         </w:rPr>
         <w:t>dn.</w:t>
       </w:r>
       <w:r>
         <w:rPr>
           <w:rFonts w:ascii="Times New Roman" w:hAnsi="Times New Roman" w:cs="Times New Roman"/>
-          <w:sz w:val="28"/>
-          <w:szCs w:val="28"/>
+          <w:sz w:val="26"/>
+          <w:szCs w:val="26"/>
         </w:rPr>
         <w:t>{{</w:t>
       </w:r>
@@ -780,8 +800,8 @@
       <w:r>
         <w:rPr>
           <w:rFonts w:ascii="Times New Roman" w:hAnsi="Times New Roman" w:cs="Times New Roman"/>
-          <w:sz w:val="28"/>
-          <w:szCs w:val="28"/>
+          <w:sz w:val="26"/>
+          <w:szCs w:val="26"/>
         </w:rPr>
         <w:t>exam_date</w:t>
       </w:r>
@@ -789,18 +809,10 @@
       <w:r>
         <w:rPr>
           <w:rFonts w:ascii="Times New Roman" w:hAnsi="Times New Roman" w:cs="Times New Roman"/>
-          <w:sz w:val="28"/>
-          <w:szCs w:val="28"/>
+          <w:sz w:val="26"/>
+          <w:szCs w:val="26"/>
         </w:rPr>
         <w:t>}}</w:t>
-      </w:r>
-      <w:r>
-        <w:rPr>
-          <w:rFonts w:ascii="Times New Roman" w:hAnsi="Times New Roman" w:cs="Times New Roman"/>
-          <w:sz w:val="28"/>
-          <w:szCs w:val="28"/>
-        </w:rPr>
-        <w:t xml:space="preserve"> </w:t>
       </w:r>
     </w:p>
     <w:p>
@@ -2835,7 +2847,6 @@
   <w:style w:type="character" w:default="1" w:styleId="Domylnaczcionkaakapitu">
     <w:name w:val="Default Paragraph Font"/>
     <w:uiPriority w:val="1"/>
-    <w:semiHidden/>
     <w:unhideWhenUsed/>
   </w:style>
   <w:style w:type="table" w:default="1" w:styleId="Standardowy">

</xml_diff>

<commit_message>
certyfikat.docx: siedziba podmiotu prowadzącego kurs – 19-311 Chruściele 22CG
Co-Authored-By: Claude Opus 5.5 <noreply@anthropic.com>
</commit_message>
<xml_diff>
--- a/backend/documents/templates/certyfikat.docx
+++ b/backend/documents/templates/certyfikat.docx
@@ -1,6 +1,6 @@
 
 <file path=word/document.xml><?xml version="1.0" encoding="utf-8"?>
-<w:document xmlns:wpc="http://schemas.microsoft.com/office/word/2010/wordprocessingCanvas" xmlns:cx="http://schemas.microsoft.com/office/drawing/2014/chartex" xmlns:cx1="http://schemas.microsoft.com/office/drawing/2015/9/8/chartex" xmlns:cx2="http://schemas.microsoft.com/office/drawing/2015/10/21/chartex" xmlns:cx3="http://schemas.microsoft.com/office/drawing/2016/5/9/chartex" xmlns:cx4="http://schemas.microsoft.com/office/drawing/2016/5/10/chartex" xmlns:cx5="http://schemas.microsoft.com/office/drawing/2016/5/11/chartex" xmlns:cx6="http://schemas.microsoft.com/office/drawing/2016/5/12/chartex" xmlns:cx7="http://schemas.microsoft.com/office/drawing/2016/5/13/chartex" xmlns:cx8="http://schemas.microsoft.com/office/drawing/2016/5/14/chartex" xmlns:mc="http://schemas.openxmlformats.org/markup-compatibility/2006" xmlns:aink="http://schemas.microsoft.com/office/drawing/2016/ink" xmlns:am3d="http://schemas.microsoft.com/office/drawing/2017/model3d" xmlns:o="urn:schemas-microsoft-com:office:office" xmlns:oel="http://schemas.microsoft.com/office/2019/extlst" xmlns:r="http://schemas.openxmlformats.org/officeDocument/2006/relationships" xmlns:m="http://schemas.openxmlformats.org/officeDocument/2006/math" xmlns:v="urn:schemas-microsoft-com:vml" xmlns:wp14="http://schemas.microsoft.com/office/word/2010/wordprocessingDrawing" xmlns:wp="http://schemas.openxmlformats.org/drawingml/2006/wordprocessingDrawing" xmlns:w10="urn:schemas-microsoft-com:office:word" xmlns:w="http://schemas.openxmlformats.org/wordprocessingml/2006/main" xmlns:w14="http://schemas.microsoft.com/office/word/2010/wordml" xmlns:w15="http://schemas.microsoft.com/office/word/2012/wordml" xmlns:w16cex="http://schemas.microsoft.com/office/word/2018/wordml/cex" xmlns:w16cid="http://schemas.microsoft.com/office/word/2016/wordml/cid" xmlns:w16="http://schemas.microsoft.com/office/word/2018/wordml" xmlns:w16du="http://schemas.microsoft.com/office/word/2023/wordml/word16du" xmlns:w16sdtdh="http://schemas.microsoft.com/office/word/2020/wordml/sdtdatahash" xmlns:w16sdtfl="http://schemas.microsoft.com/office/word/2024/wordml/sdtformatlock" xmlns:w16se="http://schemas.microsoft.com/office/word/2015/wordml/symex" xmlns:wpg="http://schemas.microsoft.com/office/word/2010/wordprocessingGroup" xmlns:wpi="http://schemas.microsoft.com/office/word/2010/wordprocessingInk" xmlns:wne="http://schemas.microsoft.com/office/word/2006/wordml" xmlns:wps="http://schemas.microsoft.com/office/word/2010/wordprocessingShape" mc:Ignorable="w14 w15 w16se w16cid w16 w16cex w16sdtdh w16sdtfl w16du wp14">
+<w:document xmlns:wpc="http://schemas.microsoft.com/office/word/2010/wordprocessingCanvas" xmlns:cx="http://schemas.microsoft.com/office/drawing/2014/chartex" xmlns:cx1="http://schemas.microsoft.com/office/drawing/2015/9/8/chartex" xmlns:cx2="http://schemas.microsoft.com/office/drawing/2015/10/21/chartex" xmlns:cx3="http://schemas.microsoft.com/office/drawing/2016/5/9/chartex" xmlns:cx4="http://schemas.microsoft.com/office/drawing/2016/5/10/chartex" xmlns:cx5="http://schemas.microsoft.com/office/drawing/2016/5/11/chartex" xmlns:cx6="http://schemas.microsoft.com/office/drawing/2016/5/12/chartex" xmlns:cx7="http://schemas.microsoft.com/office/drawing/2016/5/13/chartex" xmlns:cx8="http://schemas.microsoft.com/office/drawing/2016/5/14/chartex" xmlns:mc="http://schemas.openxmlformats.org/markup-compatibility/2006" xmlns:m="http://schemas.openxmlformats.org/officeDocument/2006/math" xmlns:aink="http://schemas.microsoft.com/office/drawing/2016/ink" xmlns:am3d="http://schemas.microsoft.com/office/drawing/2017/model3d" xmlns:oel="http://schemas.microsoft.com/office/2019/extlst" xmlns:r="http://schemas.openxmlformats.org/officeDocument/2006/relationships" xmlns:wp14="http://schemas.microsoft.com/office/word/2010/wordprocessingDrawing" xmlns:wp="http://schemas.openxmlformats.org/drawingml/2006/wordprocessingDrawing" xmlns:wpg="http://schemas.microsoft.com/office/word/2010/wordprocessingGroup" xmlns:wpi="http://schemas.microsoft.com/office/word/2010/wordprocessingInk" xmlns:wps="http://schemas.microsoft.com/office/word/2010/wordprocessingShape" xmlns:o="urn:schemas-microsoft-com:office:office" xmlns:v="urn:schemas-microsoft-com:vml" xmlns:w10="urn:schemas-microsoft-com:office:word" xmlns:w="http://schemas.openxmlformats.org/wordprocessingml/2006/main" xmlns:w14="http://schemas.microsoft.com/office/word/2010/wordml" xmlns:w15="http://schemas.microsoft.com/office/word/2012/wordml" xmlns:w16cex="http://schemas.microsoft.com/office/word/2018/wordml/cex" xmlns:w16cid="http://schemas.microsoft.com/office/word/2016/wordml/cid" xmlns:w16="http://schemas.microsoft.com/office/word/2018/wordml" xmlns:w16sdtdh="http://schemas.microsoft.com/office/word/2020/wordml/sdtdatahash" xmlns:w16sdtfl="http://schemas.microsoft.com/office/word/2024/wordml/sdtformatlock" xmlns:w16se="http://schemas.microsoft.com/office/word/2015/wordml/symex" xmlns:w16du="http://schemas.microsoft.com/office/word/2023/wordml/word16du" xmlns:wne="http://schemas.microsoft.com/office/word/2006/wordml" mc:Ignorable="w14 w15 w16se w16cid w16 w16cex w16sdtdh w16sdtfl w16du wp14">
   <w:body>
     <w:p>
       <w:pPr>
@@ -231,6 +231,7 @@
                               </w:rPr>
                               <w:t xml:space="preserve"> </w:t>
                             </w:r>
+                            <w:proofErr w:type="gramStart"/>
                             <w:r>
                               <w:rPr>
                                 <w:sz w:val="18"/>
@@ -252,7 +253,17 @@
                                 <w:sz w:val="18"/>
                                 <w:szCs w:val="18"/>
                               </w:rPr>
-                              <w:t>e-mail:</w:t>
+                              <w:t>e-mail</w:t>
+                            </w:r>
+                            <w:proofErr w:type="gramEnd"/>
+                            <w:r>
+                              <w:rPr>
+                                <w:b/>
+                                <w:bCs/>
+                                <w:sz w:val="18"/>
+                                <w:szCs w:val="18"/>
+                              </w:rPr>
+                              <w:t>:</w:t>
                             </w:r>
                             <w:r>
                               <w:rPr>
@@ -594,6 +605,7 @@
         <w:t>c_n</w:t>
       </w:r>
       <w:proofErr w:type="spellEnd"/>
+      <w:proofErr w:type="gramStart"/>
       <w:r>
         <w:rPr>
           <w:rFonts w:ascii="Times New Roman" w:hAnsi="Times New Roman" w:cs="Times New Roman"/>
@@ -614,6 +626,7 @@
         </w:rPr>
         <w:t>/</w:t>
       </w:r>
+      <w:proofErr w:type="gramEnd"/>
       <w:r>
         <w:rPr>
           <w:rFonts w:ascii="Times New Roman" w:hAnsi="Times New Roman" w:cs="Times New Roman"/>
@@ -622,8 +635,9 @@
           <w:sz w:val="26"/>
           <w:szCs w:val="26"/>
         </w:rPr>
-        <w:t>{{y}}</w:t>
-      </w:r>
+        <w:t>{{y</w:t>
+      </w:r>
+      <w:proofErr w:type="gramStart"/>
       <w:r>
         <w:rPr>
           <w:rFonts w:ascii="Times New Roman" w:hAnsi="Times New Roman" w:cs="Times New Roman"/>
@@ -632,8 +646,19 @@
           <w:sz w:val="26"/>
           <w:szCs w:val="26"/>
         </w:rPr>
+        <w:t>}}</w:t>
+      </w:r>
+      <w:r>
+        <w:rPr>
+          <w:rFonts w:ascii="Times New Roman" w:hAnsi="Times New Roman" w:cs="Times New Roman"/>
+          <w:b/>
+          <w:bCs/>
+          <w:sz w:val="26"/>
+          <w:szCs w:val="26"/>
+        </w:rPr>
         <w:t>/</w:t>
       </w:r>
+      <w:proofErr w:type="gramEnd"/>
       <w:r>
         <w:rPr>
           <w:rFonts w:ascii="Times New Roman" w:hAnsi="Times New Roman" w:cs="Times New Roman"/>
@@ -740,14 +765,31 @@
           <w:szCs w:val="28"/>
         </w:rPr>
         <w:tab/>
-        <w:t xml:space="preserve">          </w:t>
+        <w:t xml:space="preserve">       </w:t>
+      </w:r>
+      <w:proofErr w:type="gramStart"/>
+      <w:r>
+        <w:rPr>
+          <w:rFonts w:ascii="Times New Roman" w:hAnsi="Times New Roman" w:cs="Times New Roman"/>
+          <w:sz w:val="28"/>
+          <w:szCs w:val="28"/>
+        </w:rPr>
+        <w:t xml:space="preserve">   </w:t>
       </w:r>
       <w:r>
         <w:rPr>
           <w:sz w:val="26"/>
           <w:szCs w:val="26"/>
         </w:rPr>
-        <w:t>{{</w:t>
+        <w:t>{</w:t>
+      </w:r>
+      <w:proofErr w:type="gramEnd"/>
+      <w:r>
+        <w:rPr>
+          <w:sz w:val="26"/>
+          <w:szCs w:val="26"/>
+        </w:rPr>
+        <w:t>{</w:t>
       </w:r>
       <w:proofErr w:type="spellStart"/>
       <w:r>
@@ -1017,7 +1059,16 @@
           <w:sz w:val="24"/>
           <w:szCs w:val="24"/>
         </w:rPr>
-        <w:t>Pani/Pan</w:t>
+        <w:t>Pani/</w:t>
+      </w:r>
+      <w:proofErr w:type="gramStart"/>
+      <w:r>
+        <w:rPr>
+          <w:rFonts w:ascii="Times New Roman" w:hAnsi="Times New Roman" w:cs="Times New Roman"/>
+          <w:sz w:val="24"/>
+          <w:szCs w:val="24"/>
+        </w:rPr>
+        <w:t>Pan</w:t>
       </w:r>
       <w:r>
         <w:rPr>
@@ -1047,7 +1098,19 @@
           <w:sz w:val="44"/>
           <w:szCs w:val="44"/>
         </w:rPr>
-        <w:t>{{p_full_name}}</w:t>
+        <w:t>{</w:t>
+      </w:r>
+      <w:proofErr w:type="gramEnd"/>
+      <w:r>
+        <w:rPr>
+          <w:rFonts w:ascii="Times New Roman" w:hAnsi="Times New Roman" w:cs="Times New Roman"/>
+          <w:b/>
+          <w:bCs/>
+          <w:noProof/>
+          <w:sz w:val="44"/>
+          <w:szCs w:val="44"/>
+        </w:rPr>
+        <w:t>{p_full_name}}</w:t>
       </w:r>
       <w:r>
         <w:rPr>
@@ -1247,7 +1310,31 @@
           <w:sz w:val="28"/>
           <w:szCs w:val="28"/>
         </w:rPr>
-        <w:t>19-300 Ełk, ul. Szyszkowa 14/7</w:t>
+        <w:t>19-3</w:t>
+      </w:r>
+      <w:r>
+        <w:rPr>
+          <w:rFonts w:ascii="Times New Roman" w:hAnsi="Times New Roman" w:cs="Times New Roman"/>
+          <w:sz w:val="28"/>
+          <w:szCs w:val="28"/>
+        </w:rPr>
+        <w:t>11</w:t>
+      </w:r>
+      <w:r>
+        <w:rPr>
+          <w:rFonts w:ascii="Times New Roman" w:hAnsi="Times New Roman" w:cs="Times New Roman"/>
+          <w:sz w:val="28"/>
+          <w:szCs w:val="28"/>
+        </w:rPr>
+        <w:t xml:space="preserve"> </w:t>
+      </w:r>
+      <w:r>
+        <w:rPr>
+          <w:rFonts w:ascii="Times New Roman" w:hAnsi="Times New Roman" w:cs="Times New Roman"/>
+          <w:sz w:val="28"/>
+          <w:szCs w:val="28"/>
+        </w:rPr>
+        <w:t>Chruściele 22CG</w:t>
       </w:r>
       <w:r>
         <w:rPr>
@@ -1361,6 +1448,7 @@
         </w:rPr>
         <w:t>:</w:t>
       </w:r>
+      <w:proofErr w:type="gramStart"/>
       <w:r>
         <w:rPr>
           <w:rFonts w:ascii="Times New Roman" w:hAnsi="Times New Roman" w:cs="Times New Roman"/>
@@ -1378,6 +1466,7 @@
         </w:rPr>
         <w:t>od</w:t>
       </w:r>
+      <w:proofErr w:type="gramEnd"/>
       <w:r>
         <w:rPr>
           <w:rFonts w:ascii="Times New Roman" w:hAnsi="Times New Roman" w:cs="Times New Roman"/>
@@ -1512,15 +1601,16 @@
           <w:sz w:val="16"/>
           <w:szCs w:val="16"/>
         </w:rPr>
-        <w:t xml:space="preserve">                                                           </w:t>
-      </w:r>
+        <w:t xml:space="preserve">                                                        </w:t>
+      </w:r>
+      <w:proofErr w:type="gramStart"/>
       <w:r>
         <w:rPr>
           <w:rFonts w:ascii="Times New Roman" w:hAnsi="Times New Roman" w:cs="Times New Roman"/>
           <w:sz w:val="16"/>
           <w:szCs w:val="16"/>
         </w:rPr>
-        <w:t>(dzień/miesiąc/rok)</w:t>
+        <w:t xml:space="preserve">   </w:t>
       </w:r>
       <w:r>
         <w:rPr>
@@ -1528,16 +1618,16 @@
           <w:sz w:val="16"/>
           <w:szCs w:val="16"/>
         </w:rPr>
-        <w:t xml:space="preserve"> </w:t>
-      </w:r>
+        <w:t>(</w:t>
+      </w:r>
+      <w:proofErr w:type="gramEnd"/>
       <w:r>
         <w:rPr>
           <w:rFonts w:ascii="Times New Roman" w:hAnsi="Times New Roman" w:cs="Times New Roman"/>
           <w:sz w:val="16"/>
           <w:szCs w:val="16"/>
         </w:rPr>
-        <w:tab/>
-        <w:t xml:space="preserve">      </w:t>
+        <w:t>dzień/miesiąc/rok)</w:t>
       </w:r>
       <w:r>
         <w:rPr>
@@ -1545,7 +1635,42 @@
           <w:sz w:val="16"/>
           <w:szCs w:val="16"/>
         </w:rPr>
-        <w:t>(dzień/miesiąc/rok)</w:t>
+        <w:t xml:space="preserve"> </w:t>
+      </w:r>
+      <w:r>
+        <w:rPr>
+          <w:rFonts w:ascii="Times New Roman" w:hAnsi="Times New Roman" w:cs="Times New Roman"/>
+          <w:sz w:val="16"/>
+          <w:szCs w:val="16"/>
+        </w:rPr>
+        <w:tab/>
+        <w:t xml:space="preserve">   </w:t>
+      </w:r>
+      <w:proofErr w:type="gramStart"/>
+      <w:r>
+        <w:rPr>
+          <w:rFonts w:ascii="Times New Roman" w:hAnsi="Times New Roman" w:cs="Times New Roman"/>
+          <w:sz w:val="16"/>
+          <w:szCs w:val="16"/>
+        </w:rPr>
+        <w:t xml:space="preserve">   </w:t>
+      </w:r>
+      <w:r>
+        <w:rPr>
+          <w:rFonts w:ascii="Times New Roman" w:hAnsi="Times New Roman" w:cs="Times New Roman"/>
+          <w:sz w:val="16"/>
+          <w:szCs w:val="16"/>
+        </w:rPr>
+        <w:t>(</w:t>
+      </w:r>
+      <w:proofErr w:type="gramEnd"/>
+      <w:r>
+        <w:rPr>
+          <w:rFonts w:ascii="Times New Roman" w:hAnsi="Times New Roman" w:cs="Times New Roman"/>
+          <w:sz w:val="16"/>
+          <w:szCs w:val="16"/>
+        </w:rPr>
+        <w:t>dzień/miesiąc/rok)</w:t>
       </w:r>
     </w:p>
     <w:p>
@@ -2192,23 +2317,51 @@
           <w:sz w:val="16"/>
           <w:szCs w:val="16"/>
         </w:rPr>
-        <w:t>(podpis, imię i nazwisko kierownika podmiotu                                                                             (podpisy członków komisji</w:t>
-      </w:r>
+        <w:t xml:space="preserve">(podpis, imię i nazwisko kierownika podmiotu                                                                          </w:t>
+      </w:r>
+      <w:proofErr w:type="gramStart"/>
       <w:r>
         <w:rPr>
           <w:rFonts w:ascii="Times New Roman" w:hAnsi="Times New Roman" w:cs="Times New Roman"/>
           <w:sz w:val="16"/>
           <w:szCs w:val="16"/>
         </w:rPr>
-        <w:t xml:space="preserve"> </w:t>
-      </w:r>
+        <w:t xml:space="preserve">   (</w:t>
+      </w:r>
+      <w:proofErr w:type="gramEnd"/>
       <w:r>
         <w:rPr>
           <w:rFonts w:ascii="Times New Roman" w:hAnsi="Times New Roman" w:cs="Times New Roman"/>
           <w:sz w:val="16"/>
           <w:szCs w:val="16"/>
         </w:rPr>
-        <w:t>egzaminacyjnej)  przeprowadzającego egzamin)</w:t>
+        <w:t>podpisy członków komisji</w:t>
+      </w:r>
+      <w:r>
+        <w:rPr>
+          <w:rFonts w:ascii="Times New Roman" w:hAnsi="Times New Roman" w:cs="Times New Roman"/>
+          <w:sz w:val="16"/>
+          <w:szCs w:val="16"/>
+        </w:rPr>
+        <w:t xml:space="preserve"> </w:t>
+      </w:r>
+      <w:proofErr w:type="gramStart"/>
+      <w:r>
+        <w:rPr>
+          <w:rFonts w:ascii="Times New Roman" w:hAnsi="Times New Roman" w:cs="Times New Roman"/>
+          <w:sz w:val="16"/>
+          <w:szCs w:val="16"/>
+        </w:rPr>
+        <w:t>egzaminacyjnej)  przeprowadzającego</w:t>
+      </w:r>
+      <w:proofErr w:type="gramEnd"/>
+      <w:r>
+        <w:rPr>
+          <w:rFonts w:ascii="Times New Roman" w:hAnsi="Times New Roman" w:cs="Times New Roman"/>
+          <w:sz w:val="16"/>
+          <w:szCs w:val="16"/>
+        </w:rPr>
+        <w:t xml:space="preserve"> egzamin)</w:t>
       </w:r>
     </w:p>
     <w:sectPr>
@@ -2222,7 +2375,7 @@
 </file>
 
 <file path=word/styles.xml><?xml version="1.0" encoding="utf-8"?>
-<w:styles xmlns:mc="http://schemas.openxmlformats.org/markup-compatibility/2006" xmlns:r="http://schemas.openxmlformats.org/officeDocument/2006/relationships" xmlns:w="http://schemas.openxmlformats.org/wordprocessingml/2006/main" xmlns:w14="http://schemas.microsoft.com/office/word/2010/wordml" xmlns:w15="http://schemas.microsoft.com/office/word/2012/wordml" xmlns:w16cex="http://schemas.microsoft.com/office/word/2018/wordml/cex" xmlns:w16cid="http://schemas.microsoft.com/office/word/2016/wordml/cid" xmlns:w16="http://schemas.microsoft.com/office/word/2018/wordml" xmlns:w16du="http://schemas.microsoft.com/office/word/2023/wordml/word16du" xmlns:w16sdtdh="http://schemas.microsoft.com/office/word/2020/wordml/sdtdatahash" xmlns:w16sdtfl="http://schemas.microsoft.com/office/word/2024/wordml/sdtformatlock" xmlns:w16se="http://schemas.microsoft.com/office/word/2015/wordml/symex" mc:Ignorable="w14 w15 w16se w16cid w16 w16cex w16sdtdh w16sdtfl w16du">
+<w:styles xmlns:mc="http://schemas.openxmlformats.org/markup-compatibility/2006" xmlns:r="http://schemas.openxmlformats.org/officeDocument/2006/relationships" xmlns:w="http://schemas.openxmlformats.org/wordprocessingml/2006/main" xmlns:w14="http://schemas.microsoft.com/office/word/2010/wordml" xmlns:w15="http://schemas.microsoft.com/office/word/2012/wordml" xmlns:w16cex="http://schemas.microsoft.com/office/word/2018/wordml/cex" xmlns:w16cid="http://schemas.microsoft.com/office/word/2016/wordml/cid" xmlns:w16="http://schemas.microsoft.com/office/word/2018/wordml" xmlns:w16sdtdh="http://schemas.microsoft.com/office/word/2020/wordml/sdtdatahash" xmlns:w16sdtfl="http://schemas.microsoft.com/office/word/2024/wordml/sdtformatlock" xmlns:w16se="http://schemas.microsoft.com/office/word/2015/wordml/symex" xmlns:w16du="http://schemas.microsoft.com/office/word/2023/wordml/word16du" mc:Ignorable="w14 w15 w16se w16cid w16 w16cex w16sdtdh w16sdtfl w16du">
   <w:docDefaults>
     <w:rPrDefault>
       <w:rPr>
@@ -2847,6 +3000,7 @@
   <w:style w:type="character" w:default="1" w:styleId="Domylnaczcionkaakapitu">
     <w:name w:val="Default Paragraph Font"/>
     <w:uiPriority w:val="1"/>
+    <w:semiHidden/>
     <w:unhideWhenUsed/>
   </w:style>
   <w:style w:type="table" w:default="1" w:styleId="Standardowy">

</xml_diff>